<commit_message>
home... vor test mit freunden
</commit_message>
<xml_diff>
--- a/Testprotokoll für die Gestensteuerung.docx
+++ b/Testprotokoll für die Gestensteuerung.docx
@@ -18,6 +18,7 @@
     </w:p>
     <w:p>
       <w:pPr>
+        <w:spacing w:line="240" w:lineRule="auto"/>
         <w:rPr>
           <w:sz w:val="22"/>
           <w:szCs w:val="22"/>
@@ -28,385 +29,577 @@
           <w:sz w:val="22"/>
           <w:szCs w:val="22"/>
         </w:rPr>
-        <w:t>Ort: BHT-</w:t>
-      </w:r>
-      <w:r>
-        <w:rPr>
-          <w:sz w:val="22"/>
-          <w:szCs w:val="22"/>
-        </w:rPr>
-        <w:t>Berlin</w:t>
-      </w:r>
-      <w:r>
-        <w:rPr>
-          <w:sz w:val="22"/>
-          <w:szCs w:val="22"/>
-        </w:rPr>
-        <w:t>, Raum B217a | Datum:</w:t>
-      </w:r>
-      <w:r>
-        <w:rPr>
-          <w:sz w:val="22"/>
-          <w:szCs w:val="22"/>
-        </w:rPr>
-        <w:t xml:space="preserve"> _</w:t>
-      </w:r>
-      <w:r>
-        <w:rPr>
-          <w:sz w:val="22"/>
-          <w:szCs w:val="22"/>
-        </w:rPr>
-        <w:t>__</w:t>
-      </w:r>
-      <w:r>
-        <w:rPr>
-          <w:sz w:val="22"/>
-          <w:szCs w:val="22"/>
-        </w:rPr>
-        <w:t xml:space="preserve">.09.2026 | Proband: </w:t>
-      </w:r>
-      <w:r>
-        <w:rPr>
-          <w:sz w:val="22"/>
-          <w:szCs w:val="22"/>
-        </w:rPr>
-        <w:t xml:space="preserve">______ </w:t>
-      </w:r>
-      <w:r>
-        <w:rPr>
-          <w:sz w:val="22"/>
-          <w:szCs w:val="22"/>
-        </w:rPr>
-        <w:t xml:space="preserve">| Alter: </w:t>
-      </w:r>
-      <w:r>
-        <w:rPr>
-          <w:sz w:val="22"/>
-          <w:szCs w:val="22"/>
-        </w:rPr>
-        <w:t xml:space="preserve">___ </w:t>
-      </w:r>
-      <w:r>
-        <w:rPr>
-          <w:sz w:val="22"/>
-          <w:szCs w:val="22"/>
-        </w:rPr>
-        <w:t xml:space="preserve">| Größe: </w:t>
-      </w:r>
-      <w:r>
-        <w:rPr>
-          <w:sz w:val="22"/>
-          <w:szCs w:val="22"/>
-        </w:rPr>
-        <w:t>____</w:t>
-      </w:r>
-      <w:r>
-        <w:rPr>
-          <w:sz w:val="22"/>
-          <w:szCs w:val="22"/>
-        </w:rPr>
-        <w:t xml:space="preserve"> c</w:t>
-      </w:r>
-      <w:r>
-        <w:rPr>
-          <w:sz w:val="22"/>
-          <w:szCs w:val="22"/>
-        </w:rPr>
-        <w:t>m</w:t>
-      </w:r>
-    </w:p>
-    <w:p>
-      <w:r>
-        <w:rPr>
-          <w:sz w:val="22"/>
-          <w:szCs w:val="22"/>
-        </w:rPr>
-        <w:t xml:space="preserve">Unterarme sind durch Kleidung bedeckt: </w:t>
-      </w:r>
-      <w:r>
-        <w:rPr>
-          <w:sz w:val="22"/>
-          <w:szCs w:val="22"/>
-        </w:rPr>
-        <w:t xml:space="preserve"> </w:t>
-      </w:r>
-      <w:r>
-        <w:rPr>
-          <w:sz w:val="22"/>
-          <w:szCs w:val="22"/>
-          <w:u w:val="single"/>
-        </w:rPr>
-        <w:t>ja /nein</w:t>
-      </w:r>
-      <w:r>
-        <w:rPr>
-          <w:sz w:val="22"/>
-          <w:szCs w:val="22"/>
-        </w:rPr>
-        <w:t xml:space="preserve"> | </w:t>
-      </w:r>
-      <w:r>
-        <w:rPr>
-          <w:sz w:val="22"/>
-          <w:szCs w:val="22"/>
-        </w:rPr>
-        <w:t>Sonstige optische Merkmale des Probanden:</w:t>
-      </w:r>
-      <w:r>
-        <w:br/>
-        <w:t>______________________________________________________________________________________________________________________________________________________________________________________________________________________________________________________</w:t>
-      </w:r>
-    </w:p>
-    <w:p>
-      <w:r>
-        <w:rPr>
-          <w:sz w:val="32"/>
-          <w:szCs w:val="32"/>
-        </w:rPr>
-        <w:t>Erster</w:t>
-      </w:r>
-      <w:r>
-        <w:rPr>
-          <w:sz w:val="32"/>
-          <w:szCs w:val="32"/>
-        </w:rPr>
-        <w:t xml:space="preserve"> E</w:t>
-      </w:r>
-      <w:r>
-        <w:rPr>
-          <w:sz w:val="32"/>
-          <w:szCs w:val="32"/>
-        </w:rPr>
-        <w:t>indruck</w:t>
-      </w:r>
-      <w:r>
-        <w:rPr>
-          <w:sz w:val="32"/>
-          <w:szCs w:val="32"/>
-        </w:rPr>
-        <w:t xml:space="preserve"> </w:t>
-      </w:r>
-      <w:r>
-        <w:rPr>
-          <w:sz w:val="32"/>
-          <w:szCs w:val="32"/>
-        </w:rPr>
-        <w:br/>
-      </w:r>
-      <w:r>
-        <w:t>du</w:t>
-      </w:r>
-      <w:r>
-        <w:t xml:space="preserve"> spielst den Dirigenten und kannst deine Musikinstrumente im Raum platzieren (die Soundwiedergabe ist noch nicht verbunden). Probiere die Steuerung aus und entdecke alle Funktionen!</w:t>
+        <w:t>Im Rahmen der</w:t>
+      </w:r>
+      <w:r>
+        <w:rPr>
+          <w:sz w:val="22"/>
+          <w:szCs w:val="22"/>
+        </w:rPr>
+        <w:t xml:space="preserve"> Masterarbeit von Jonas Wegener</w:t>
       </w:r>
     </w:p>
     <w:p>
       <w:pPr>
+        <w:spacing w:line="240" w:lineRule="auto"/>
+        <w:rPr>
+          <w:sz w:val="22"/>
+          <w:szCs w:val="22"/>
+        </w:rPr>
+      </w:pPr>
+      <w:r>
+        <w:rPr>
+          <w:sz w:val="22"/>
+          <w:szCs w:val="22"/>
+        </w:rPr>
+        <w:t>Ort: BHT-</w:t>
+      </w:r>
+      <w:r>
+        <w:rPr>
+          <w:sz w:val="22"/>
+          <w:szCs w:val="22"/>
+        </w:rPr>
+        <w:t>Berlin</w:t>
+      </w:r>
+      <w:r>
+        <w:rPr>
+          <w:sz w:val="22"/>
+          <w:szCs w:val="22"/>
+        </w:rPr>
+        <w:t>, Raum B217a | Datum:</w:t>
+      </w:r>
+      <w:r>
+        <w:rPr>
+          <w:sz w:val="22"/>
+          <w:szCs w:val="22"/>
+        </w:rPr>
+        <w:t xml:space="preserve"> _</w:t>
+      </w:r>
+      <w:r>
+        <w:rPr>
+          <w:sz w:val="22"/>
+          <w:szCs w:val="22"/>
+        </w:rPr>
+        <w:t xml:space="preserve">__.09.2026 | Proband: </w:t>
+      </w:r>
+      <w:r>
+        <w:rPr>
+          <w:sz w:val="22"/>
+          <w:szCs w:val="22"/>
+        </w:rPr>
+        <w:t xml:space="preserve">______ </w:t>
+      </w:r>
+      <w:r>
+        <w:rPr>
+          <w:sz w:val="22"/>
+          <w:szCs w:val="22"/>
+        </w:rPr>
+        <w:t xml:space="preserve">| Alter: </w:t>
+      </w:r>
+      <w:r>
+        <w:rPr>
+          <w:sz w:val="22"/>
+          <w:szCs w:val="22"/>
+        </w:rPr>
+        <w:t xml:space="preserve">___ </w:t>
+      </w:r>
+      <w:r>
+        <w:rPr>
+          <w:sz w:val="22"/>
+          <w:szCs w:val="22"/>
+        </w:rPr>
+        <w:t xml:space="preserve">| Größe: </w:t>
+      </w:r>
+      <w:r>
+        <w:rPr>
+          <w:sz w:val="22"/>
+          <w:szCs w:val="22"/>
+        </w:rPr>
+        <w:t>____</w:t>
+      </w:r>
+      <w:r>
+        <w:rPr>
+          <w:sz w:val="22"/>
+          <w:szCs w:val="22"/>
+        </w:rPr>
+        <w:t xml:space="preserve"> cm</w:t>
+      </w:r>
+    </w:p>
+    <w:p>
+      <w:pPr>
+        <w:spacing w:line="240" w:lineRule="auto"/>
+        <w:rPr>
+          <w:sz w:val="22"/>
+          <w:szCs w:val="22"/>
+        </w:rPr>
+      </w:pPr>
+      <w:r>
+        <w:rPr>
+          <w:sz w:val="22"/>
+          <w:szCs w:val="22"/>
+        </w:rPr>
+        <w:t xml:space="preserve">Unterarme sind durch Kleidung bedeckt:  </w:t>
+      </w:r>
+      <w:r>
+        <w:rPr>
+          <w:sz w:val="22"/>
+          <w:szCs w:val="22"/>
+          <w:u w:val="single"/>
+        </w:rPr>
+        <w:t>ja /nein</w:t>
+      </w:r>
+      <w:r>
+        <w:rPr>
+          <w:sz w:val="22"/>
+          <w:szCs w:val="22"/>
+        </w:rPr>
+        <w:t xml:space="preserve"> | Sonstige optische Merkmale des Probanden:</w:t>
+      </w:r>
+      <w:r>
+        <w:rPr>
+          <w:sz w:val="22"/>
+          <w:szCs w:val="22"/>
+        </w:rPr>
+        <w:br/>
+        <w:t>__________________________________________________________________________________</w:t>
+      </w:r>
+      <w:r>
+        <w:rPr>
+          <w:sz w:val="22"/>
+          <w:szCs w:val="22"/>
+        </w:rPr>
+        <w:t>_______</w:t>
+      </w:r>
+    </w:p>
+    <w:p>
+      <w:pPr>
+        <w:spacing w:line="240" w:lineRule="auto"/>
+        <w:rPr>
+          <w:sz w:val="22"/>
+          <w:szCs w:val="22"/>
+        </w:rPr>
+      </w:pPr>
+      <w:r>
         <w:rPr>
           <w:sz w:val="32"/>
           <w:szCs w:val="32"/>
         </w:rPr>
+        <w:t>Erster</w:t>
+      </w:r>
+      <w:r>
+        <w:rPr>
+          <w:sz w:val="32"/>
+          <w:szCs w:val="32"/>
+        </w:rPr>
+        <w:t xml:space="preserve"> E</w:t>
+      </w:r>
+      <w:r>
+        <w:rPr>
+          <w:sz w:val="32"/>
+          <w:szCs w:val="32"/>
+        </w:rPr>
+        <w:t>indruck</w:t>
+      </w:r>
+      <w:r>
+        <w:rPr>
+          <w:sz w:val="32"/>
+          <w:szCs w:val="32"/>
+        </w:rPr>
+        <w:t xml:space="preserve"> </w:t>
+      </w:r>
+      <w:r>
+        <w:rPr>
+          <w:sz w:val="32"/>
+          <w:szCs w:val="32"/>
+        </w:rPr>
+        <w:br/>
+      </w:r>
+      <w:r>
+        <w:rPr>
+          <w:sz w:val="22"/>
+          <w:szCs w:val="22"/>
+        </w:rPr>
+        <w:t>D</w:t>
+      </w:r>
+      <w:r>
+        <w:rPr>
+          <w:sz w:val="22"/>
+          <w:szCs w:val="22"/>
+        </w:rPr>
+        <w:t>u spielst den Dirigenten und kannst deine Musikinstrumente im Raum platzieren (die Soundwiedergabe ist noch nicht verbunden). Probiere die Steuerung aus und entdecke alle Funktionen!</w:t>
+      </w:r>
+    </w:p>
+    <w:p>
+      <w:pPr>
+        <w:rPr>
+          <w:sz w:val="22"/>
+          <w:szCs w:val="22"/>
+        </w:rPr>
       </w:pPr>
       <w:r>
+        <w:rPr>
+          <w:sz w:val="22"/>
+          <w:szCs w:val="22"/>
+        </w:rPr>
         <w:t>Welche Funktionen und Steuergesten wurden gefunden und konnten genutzt werden:</w:t>
       </w:r>
       <w:r>
+        <w:rPr>
+          <w:sz w:val="22"/>
+          <w:szCs w:val="22"/>
+        </w:rPr>
         <w:br/>
       </w:r>
       <w:r>
         <w:rPr>
+          <w:sz w:val="22"/>
+          <w:szCs w:val="22"/>
           <w:u w:val="single"/>
         </w:rPr>
         <w:t>Funktion</w:t>
       </w:r>
       <w:r>
         <w:rPr>
+          <w:sz w:val="22"/>
+          <w:szCs w:val="22"/>
+        </w:rPr>
+        <w:tab/>
+      </w:r>
+      <w:r>
+        <w:rPr>
+          <w:sz w:val="22"/>
+          <w:szCs w:val="22"/>
+        </w:rPr>
+        <w:tab/>
+      </w:r>
+      <w:r>
+        <w:rPr>
+          <w:sz w:val="22"/>
+          <w:szCs w:val="22"/>
+        </w:rPr>
+        <w:tab/>
+      </w:r>
+      <w:r>
+        <w:rPr>
+          <w:sz w:val="22"/>
+          <w:szCs w:val="22"/>
+        </w:rPr>
+        <w:tab/>
+      </w:r>
+      <w:r>
+        <w:rPr>
+          <w:sz w:val="22"/>
+          <w:szCs w:val="22"/>
+        </w:rPr>
+        <w:tab/>
+      </w:r>
+      <w:r>
+        <w:rPr>
+          <w:sz w:val="22"/>
+          <w:szCs w:val="22"/>
           <w:u w:val="single"/>
         </w:rPr>
-        <w:tab/>
-      </w:r>
-      <w:r>
-        <w:rPr>
+        <w:t>gefunden</w:t>
+      </w:r>
+      <w:r>
+        <w:rPr>
+          <w:sz w:val="22"/>
+          <w:szCs w:val="22"/>
+        </w:rPr>
+        <w:tab/>
+      </w:r>
+      <w:r>
+        <w:rPr>
+          <w:sz w:val="22"/>
+          <w:szCs w:val="22"/>
           <w:u w:val="single"/>
         </w:rPr>
-        <w:tab/>
-      </w:r>
-      <w:r>
-        <w:rPr>
-          <w:u w:val="single"/>
-        </w:rPr>
-        <w:tab/>
-      </w:r>
-      <w:r>
-        <w:rPr>
-          <w:u w:val="single"/>
-        </w:rPr>
-        <w:tab/>
-      </w:r>
-      <w:r>
-        <w:rPr>
-          <w:u w:val="single"/>
-        </w:rPr>
-        <w:tab/>
-        <w:t>gefunden</w:t>
-      </w:r>
-      <w:r>
-        <w:rPr>
-          <w:u w:val="single"/>
-        </w:rPr>
-        <w:tab/>
         <w:t>erfolgreich genutzt</w:t>
       </w:r>
       <w:r>
+        <w:rPr>
+          <w:sz w:val="22"/>
+          <w:szCs w:val="22"/>
+        </w:rPr>
         <w:br/>
         <w:t xml:space="preserve">Greifen und Verschieben </w:t>
       </w:r>
       <w:r>
-        <w:tab/>
-      </w:r>
-      <w:r>
-        <w:tab/>
-      </w:r>
-      <w:r>
-        <w:tab/>
-      </w:r>
-      <w:r>
+        <w:rPr>
+          <w:sz w:val="22"/>
+          <w:szCs w:val="22"/>
+        </w:rPr>
+        <w:tab/>
+      </w:r>
+      <w:r>
+        <w:rPr>
+          <w:sz w:val="22"/>
+          <w:szCs w:val="22"/>
+        </w:rPr>
+        <w:tab/>
+      </w:r>
+      <w:r>
+        <w:rPr>
+          <w:sz w:val="22"/>
+          <w:szCs w:val="22"/>
+        </w:rPr>
+        <w:tab/>
         <w:t>☐</w:t>
       </w:r>
       <w:r>
-        <w:tab/>
-      </w:r>
-      <w:r>
-        <w:tab/>
-      </w:r>
-      <w:r>
+        <w:rPr>
+          <w:sz w:val="22"/>
+          <w:szCs w:val="22"/>
+        </w:rPr>
+        <w:tab/>
+      </w:r>
+      <w:r>
+        <w:rPr>
+          <w:sz w:val="22"/>
+          <w:szCs w:val="22"/>
+        </w:rPr>
+        <w:tab/>
         <w:t>☐</w:t>
       </w:r>
       <w:r>
+        <w:rPr>
+          <w:sz w:val="22"/>
+          <w:szCs w:val="22"/>
+        </w:rPr>
         <w:br/>
         <w:t>Lautstärke ändern</w:t>
       </w:r>
       <w:r>
-        <w:tab/>
-      </w:r>
-      <w:r>
-        <w:tab/>
-      </w:r>
-      <w:r>
-        <w:tab/>
-      </w:r>
-      <w:r>
-        <w:tab/>
-      </w:r>
-      <w:r>
+        <w:rPr>
+          <w:sz w:val="22"/>
+          <w:szCs w:val="22"/>
+        </w:rPr>
+        <w:tab/>
+      </w:r>
+      <w:r>
+        <w:rPr>
+          <w:sz w:val="22"/>
+          <w:szCs w:val="22"/>
+        </w:rPr>
+        <w:tab/>
+      </w:r>
+      <w:r>
+        <w:rPr>
+          <w:sz w:val="22"/>
+          <w:szCs w:val="22"/>
+        </w:rPr>
+        <w:tab/>
+      </w:r>
+      <w:r>
+        <w:rPr>
+          <w:sz w:val="22"/>
+          <w:szCs w:val="22"/>
+        </w:rPr>
+        <w:tab/>
         <w:t>☐</w:t>
       </w:r>
       <w:r>
-        <w:tab/>
-      </w:r>
-      <w:r>
-        <w:tab/>
-      </w:r>
-      <w:r>
+        <w:rPr>
+          <w:sz w:val="22"/>
+          <w:szCs w:val="22"/>
+        </w:rPr>
+        <w:tab/>
+      </w:r>
+      <w:r>
+        <w:rPr>
+          <w:sz w:val="22"/>
+          <w:szCs w:val="22"/>
+        </w:rPr>
+        <w:tab/>
         <w:t>☐</w:t>
       </w:r>
       <w:r>
+        <w:rPr>
+          <w:sz w:val="22"/>
+          <w:szCs w:val="22"/>
+        </w:rPr>
         <w:br/>
         <w:t>Informations-Fenster erhalten</w:t>
       </w:r>
       <w:r>
-        <w:tab/>
-      </w:r>
-      <w:r>
-        <w:tab/>
-      </w:r>
-      <w:r>
+        <w:rPr>
+          <w:sz w:val="22"/>
+          <w:szCs w:val="22"/>
+        </w:rPr>
+        <w:tab/>
+      </w:r>
+      <w:r>
+        <w:rPr>
+          <w:sz w:val="22"/>
+          <w:szCs w:val="22"/>
+        </w:rPr>
+        <w:tab/>
         <w:t>☐</w:t>
       </w:r>
       <w:r>
-        <w:tab/>
-      </w:r>
-      <w:r>
-        <w:tab/>
-      </w:r>
-      <w:r>
+        <w:rPr>
+          <w:sz w:val="22"/>
+          <w:szCs w:val="22"/>
+        </w:rPr>
+        <w:tab/>
+      </w:r>
+      <w:r>
+        <w:rPr>
+          <w:sz w:val="22"/>
+          <w:szCs w:val="22"/>
+        </w:rPr>
+        <w:tab/>
         <w:t>☐</w:t>
       </w:r>
       <w:r>
+        <w:rPr>
+          <w:sz w:val="22"/>
+          <w:szCs w:val="22"/>
+        </w:rPr>
         <w:br/>
         <w:t xml:space="preserve">Prozess Live-Infos ein und aus blenden </w:t>
       </w:r>
       <w:r>
-        <w:tab/>
-      </w:r>
-      <w:r>
+        <w:rPr>
+          <w:sz w:val="22"/>
+          <w:szCs w:val="22"/>
+        </w:rPr>
+        <w:tab/>
         <w:t>☐</w:t>
       </w:r>
       <w:r>
-        <w:tab/>
-      </w:r>
-      <w:r>
-        <w:tab/>
-      </w:r>
-      <w:r>
+        <w:rPr>
+          <w:sz w:val="22"/>
+          <w:szCs w:val="22"/>
+        </w:rPr>
+        <w:tab/>
+      </w:r>
+      <w:r>
+        <w:rPr>
+          <w:sz w:val="22"/>
+          <w:szCs w:val="22"/>
+        </w:rPr>
+        <w:tab/>
         <w:t>☐</w:t>
       </w:r>
       <w:r>
+        <w:rPr>
+          <w:sz w:val="22"/>
+          <w:szCs w:val="22"/>
+        </w:rPr>
         <w:br/>
         <w:t xml:space="preserve">alle Instrumente zurücksetzen </w:t>
       </w:r>
       <w:r>
-        <w:tab/>
-      </w:r>
-      <w:r>
-        <w:tab/>
-      </w:r>
-      <w:r>
+        <w:rPr>
+          <w:sz w:val="22"/>
+          <w:szCs w:val="22"/>
+        </w:rPr>
+        <w:tab/>
+      </w:r>
+      <w:r>
+        <w:rPr>
+          <w:sz w:val="22"/>
+          <w:szCs w:val="22"/>
+        </w:rPr>
+        <w:tab/>
         <w:t>☐</w:t>
       </w:r>
       <w:r>
-        <w:tab/>
-      </w:r>
-      <w:r>
-        <w:tab/>
-      </w:r>
-      <w:r>
+        <w:rPr>
+          <w:sz w:val="22"/>
+          <w:szCs w:val="22"/>
+        </w:rPr>
+        <w:tab/>
+      </w:r>
+      <w:r>
+        <w:rPr>
+          <w:sz w:val="22"/>
+          <w:szCs w:val="22"/>
+        </w:rPr>
+        <w:tab/>
         <w:t>☐</w:t>
       </w:r>
       <w:r>
+        <w:rPr>
+          <w:sz w:val="22"/>
+          <w:szCs w:val="22"/>
+        </w:rPr>
         <w:br/>
         <w:t>das Programm beenden</w:t>
       </w:r>
       <w:r>
-        <w:tab/>
-      </w:r>
-      <w:r>
-        <w:tab/>
-      </w:r>
-      <w:r>
-        <w:tab/>
-      </w:r>
-      <w:r>
+        <w:rPr>
+          <w:sz w:val="22"/>
+          <w:szCs w:val="22"/>
+        </w:rPr>
+        <w:tab/>
+      </w:r>
+      <w:r>
+        <w:rPr>
+          <w:sz w:val="22"/>
+          <w:szCs w:val="22"/>
+        </w:rPr>
+        <w:tab/>
+      </w:r>
+      <w:r>
+        <w:rPr>
+          <w:sz w:val="22"/>
+          <w:szCs w:val="22"/>
+        </w:rPr>
+        <w:tab/>
         <w:t>☐</w:t>
       </w:r>
       <w:r>
-        <w:tab/>
-      </w:r>
-      <w:r>
-        <w:tab/>
-      </w:r>
-      <w:r>
+        <w:rPr>
+          <w:sz w:val="22"/>
+          <w:szCs w:val="22"/>
+        </w:rPr>
+        <w:tab/>
+      </w:r>
+      <w:r>
+        <w:rPr>
+          <w:sz w:val="22"/>
+          <w:szCs w:val="22"/>
+        </w:rPr>
+        <w:tab/>
         <w:t>☐</w:t>
       </w:r>
     </w:p>
     <w:p>
       <w:r>
+        <w:rPr>
+          <w:sz w:val="22"/>
+          <w:szCs w:val="22"/>
+        </w:rPr>
         <w:t xml:space="preserve">War </w:t>
       </w:r>
       <w:r>
-        <w:t>es intuitiv zu bedienen?</w:t>
-      </w:r>
-      <w:r>
+        <w:rPr>
+          <w:sz w:val="22"/>
+          <w:szCs w:val="22"/>
+        </w:rPr>
+        <w:t xml:space="preserve">es </w:t>
+      </w:r>
+      <w:r>
+        <w:rPr>
+          <w:sz w:val="22"/>
+          <w:szCs w:val="22"/>
+        </w:rPr>
+        <w:t xml:space="preserve">einfach und </w:t>
+      </w:r>
+      <w:r>
+        <w:rPr>
+          <w:sz w:val="22"/>
+          <w:szCs w:val="22"/>
+        </w:rPr>
+        <w:t>intuitiv zu bedienen?</w:t>
+      </w:r>
+      <w:r>
+        <w:rPr>
+          <w:sz w:val="22"/>
+          <w:szCs w:val="22"/>
+        </w:rPr>
         <w:t xml:space="preserve"> Was hat gefallen? Was sollte anders sein?</w:t>
       </w:r>
       <w:r>
@@ -415,11 +608,1240 @@
       </w:r>
     </w:p>
     <w:p>
-      <w:r>
+      <w:pPr>
+        <w:tabs>
+          <w:tab w:val="left" w:pos="2568"/>
+        </w:tabs>
+        <w:spacing w:line="240" w:lineRule="auto"/>
+        <w:rPr>
+          <w:sz w:val="22"/>
+          <w:szCs w:val="22"/>
+        </w:rPr>
+      </w:pPr>
+      <w:r>
+        <w:rPr>
+          <w:sz w:val="32"/>
+          <w:szCs w:val="32"/>
+        </w:rPr>
+        <w:t>Konkrete Tes</w:t>
+      </w:r>
+      <w:r>
+        <w:rPr>
+          <w:sz w:val="32"/>
+          <w:szCs w:val="32"/>
+        </w:rPr>
+        <w:t>ts</w:t>
+      </w:r>
+      <w:r>
+        <w:rPr>
+          <w:sz w:val="32"/>
+          <w:szCs w:val="32"/>
+        </w:rPr>
         <w:br/>
       </w:r>
       <w:r>
+        <w:rPr>
+          <w:sz w:val="22"/>
+          <w:szCs w:val="22"/>
+        </w:rPr>
+        <w:t xml:space="preserve">Test 1: setze </w:t>
+      </w:r>
+      <w:r>
+        <w:rPr>
+          <w:sz w:val="22"/>
+          <w:szCs w:val="22"/>
+        </w:rPr>
+        <w:t>fünf</w:t>
+      </w:r>
+      <w:r>
+        <w:rPr>
+          <w:sz w:val="22"/>
+          <w:szCs w:val="22"/>
+        </w:rPr>
+        <w:t xml:space="preserve"> Instrumente </w:t>
+      </w:r>
+      <w:r>
+        <w:rPr>
+          <w:sz w:val="22"/>
+          <w:szCs w:val="22"/>
+        </w:rPr>
+        <w:t>in</w:t>
+      </w:r>
+      <w:r>
+        <w:rPr>
+          <w:sz w:val="22"/>
+          <w:szCs w:val="22"/>
+        </w:rPr>
+        <w:t xml:space="preserve"> bestimmte Raumrichtungen</w:t>
+      </w:r>
+    </w:p>
+    <w:tbl>
+      <w:tblPr>
+        <w:tblStyle w:val="Tabellenraster"/>
+        <w:tblW w:w="0" w:type="auto"/>
+        <w:tblLook w:val="04A0" w:firstRow="1" w:lastRow="0" w:firstColumn="1" w:lastColumn="0" w:noHBand="0" w:noVBand="1"/>
+      </w:tblPr>
+      <w:tblGrid>
+        <w:gridCol w:w="704"/>
+        <w:gridCol w:w="1701"/>
+        <w:gridCol w:w="2268"/>
+        <w:gridCol w:w="1985"/>
+        <w:gridCol w:w="2404"/>
+      </w:tblGrid>
+      <w:tr>
+        <w:tc>
+          <w:tcPr>
+            <w:tcW w:w="704" w:type="dxa"/>
+          </w:tcPr>
+          <w:p>
+            <w:pPr>
+              <w:tabs>
+                <w:tab w:val="left" w:pos="2568"/>
+              </w:tabs>
+              <w:rPr>
+                <w:sz w:val="22"/>
+                <w:szCs w:val="22"/>
+              </w:rPr>
+            </w:pPr>
+            <w:proofErr w:type="spellStart"/>
+            <w:r>
+              <w:rPr>
+                <w:sz w:val="22"/>
+                <w:szCs w:val="22"/>
+              </w:rPr>
+              <w:t>unit</w:t>
+            </w:r>
+            <w:proofErr w:type="spellEnd"/>
+          </w:p>
+        </w:tc>
+        <w:tc>
+          <w:tcPr>
+            <w:tcW w:w="1701" w:type="dxa"/>
+          </w:tcPr>
+          <w:p>
+            <w:pPr>
+              <w:tabs>
+                <w:tab w:val="left" w:pos="2568"/>
+              </w:tabs>
+              <w:rPr>
+                <w:sz w:val="22"/>
+                <w:szCs w:val="22"/>
+              </w:rPr>
+            </w:pPr>
+            <w:r>
+              <w:rPr>
+                <w:sz w:val="22"/>
+                <w:szCs w:val="22"/>
+              </w:rPr>
+              <w:t>Azimut soll</w:t>
+            </w:r>
+          </w:p>
+        </w:tc>
+        <w:tc>
+          <w:tcPr>
+            <w:tcW w:w="2268" w:type="dxa"/>
+          </w:tcPr>
+          <w:p>
+            <w:pPr>
+              <w:tabs>
+                <w:tab w:val="left" w:pos="2568"/>
+              </w:tabs>
+              <w:rPr>
+                <w:sz w:val="22"/>
+                <w:szCs w:val="22"/>
+              </w:rPr>
+            </w:pPr>
+            <w:r>
+              <w:rPr>
+                <w:sz w:val="22"/>
+                <w:szCs w:val="22"/>
+              </w:rPr>
+              <w:t>Azimut erkannt</w:t>
+            </w:r>
+          </w:p>
+        </w:tc>
+        <w:tc>
+          <w:tcPr>
+            <w:tcW w:w="1985" w:type="dxa"/>
+          </w:tcPr>
+          <w:p>
+            <w:pPr>
+              <w:tabs>
+                <w:tab w:val="left" w:pos="2568"/>
+              </w:tabs>
+              <w:rPr>
+                <w:sz w:val="22"/>
+                <w:szCs w:val="22"/>
+              </w:rPr>
+            </w:pPr>
+            <w:r>
+              <w:rPr>
+                <w:sz w:val="22"/>
+                <w:szCs w:val="22"/>
+              </w:rPr>
+              <w:t>Elevation soll</w:t>
+            </w:r>
+          </w:p>
+        </w:tc>
+        <w:tc>
+          <w:tcPr>
+            <w:tcW w:w="2404" w:type="dxa"/>
+          </w:tcPr>
+          <w:p>
+            <w:pPr>
+              <w:tabs>
+                <w:tab w:val="left" w:pos="2568"/>
+              </w:tabs>
+              <w:rPr>
+                <w:sz w:val="22"/>
+                <w:szCs w:val="22"/>
+              </w:rPr>
+            </w:pPr>
+            <w:r>
+              <w:rPr>
+                <w:sz w:val="22"/>
+                <w:szCs w:val="22"/>
+              </w:rPr>
+              <w:t>Elevation erkannt</w:t>
+            </w:r>
+          </w:p>
+        </w:tc>
+      </w:tr>
+      <w:tr>
+        <w:tc>
+          <w:tcPr>
+            <w:tcW w:w="704" w:type="dxa"/>
+          </w:tcPr>
+          <w:p>
+            <w:pPr>
+              <w:tabs>
+                <w:tab w:val="left" w:pos="2568"/>
+              </w:tabs>
+              <w:rPr>
+                <w:sz w:val="22"/>
+                <w:szCs w:val="22"/>
+              </w:rPr>
+            </w:pPr>
+            <w:r>
+              <w:rPr>
+                <w:sz w:val="22"/>
+                <w:szCs w:val="22"/>
+              </w:rPr>
+              <w:t>1</w:t>
+            </w:r>
+          </w:p>
+        </w:tc>
+        <w:tc>
+          <w:tcPr>
+            <w:tcW w:w="1701" w:type="dxa"/>
+          </w:tcPr>
+          <w:p>
+            <w:pPr>
+              <w:tabs>
+                <w:tab w:val="left" w:pos="2568"/>
+              </w:tabs>
+              <w:rPr>
+                <w:sz w:val="22"/>
+                <w:szCs w:val="22"/>
+              </w:rPr>
+            </w:pPr>
+            <w:r>
+              <w:rPr>
+                <w:sz w:val="22"/>
+                <w:szCs w:val="22"/>
+              </w:rPr>
+              <w:t>0°</w:t>
+            </w:r>
+          </w:p>
+        </w:tc>
+        <w:tc>
+          <w:tcPr>
+            <w:tcW w:w="2268" w:type="dxa"/>
+          </w:tcPr>
+          <w:p>
+            <w:pPr>
+              <w:tabs>
+                <w:tab w:val="left" w:pos="2568"/>
+              </w:tabs>
+              <w:rPr>
+                <w:sz w:val="22"/>
+                <w:szCs w:val="22"/>
+              </w:rPr>
+            </w:pPr>
+          </w:p>
+        </w:tc>
+        <w:tc>
+          <w:tcPr>
+            <w:tcW w:w="1985" w:type="dxa"/>
+          </w:tcPr>
+          <w:p>
+            <w:pPr>
+              <w:tabs>
+                <w:tab w:val="left" w:pos="2568"/>
+              </w:tabs>
+              <w:rPr>
+                <w:sz w:val="22"/>
+                <w:szCs w:val="22"/>
+              </w:rPr>
+            </w:pPr>
+            <w:r>
+              <w:rPr>
+                <w:sz w:val="22"/>
+                <w:szCs w:val="22"/>
+              </w:rPr>
+              <w:t>0°</w:t>
+            </w:r>
+          </w:p>
+        </w:tc>
+        <w:tc>
+          <w:tcPr>
+            <w:tcW w:w="2404" w:type="dxa"/>
+          </w:tcPr>
+          <w:p>
+            <w:pPr>
+              <w:tabs>
+                <w:tab w:val="left" w:pos="2568"/>
+              </w:tabs>
+              <w:rPr>
+                <w:sz w:val="22"/>
+                <w:szCs w:val="22"/>
+              </w:rPr>
+            </w:pPr>
+          </w:p>
+        </w:tc>
+      </w:tr>
+      <w:tr>
+        <w:tc>
+          <w:tcPr>
+            <w:tcW w:w="704" w:type="dxa"/>
+          </w:tcPr>
+          <w:p>
+            <w:pPr>
+              <w:tabs>
+                <w:tab w:val="left" w:pos="2568"/>
+              </w:tabs>
+              <w:rPr>
+                <w:sz w:val="22"/>
+                <w:szCs w:val="22"/>
+              </w:rPr>
+            </w:pPr>
+            <w:r>
+              <w:rPr>
+                <w:sz w:val="22"/>
+                <w:szCs w:val="22"/>
+              </w:rPr>
+              <w:t>2</w:t>
+            </w:r>
+          </w:p>
+        </w:tc>
+        <w:tc>
+          <w:tcPr>
+            <w:tcW w:w="1701" w:type="dxa"/>
+          </w:tcPr>
+          <w:p>
+            <w:pPr>
+              <w:tabs>
+                <w:tab w:val="left" w:pos="2568"/>
+              </w:tabs>
+              <w:rPr>
+                <w:sz w:val="22"/>
+                <w:szCs w:val="22"/>
+              </w:rPr>
+            </w:pPr>
+            <w:r>
+              <w:rPr>
+                <w:sz w:val="22"/>
+                <w:szCs w:val="22"/>
+              </w:rPr>
+              <w:t>15°</w:t>
+            </w:r>
+          </w:p>
+        </w:tc>
+        <w:tc>
+          <w:tcPr>
+            <w:tcW w:w="2268" w:type="dxa"/>
+          </w:tcPr>
+          <w:p>
+            <w:pPr>
+              <w:tabs>
+                <w:tab w:val="left" w:pos="2568"/>
+              </w:tabs>
+              <w:rPr>
+                <w:sz w:val="22"/>
+                <w:szCs w:val="22"/>
+              </w:rPr>
+            </w:pPr>
+          </w:p>
+        </w:tc>
+        <w:tc>
+          <w:tcPr>
+            <w:tcW w:w="1985" w:type="dxa"/>
+          </w:tcPr>
+          <w:p>
+            <w:pPr>
+              <w:tabs>
+                <w:tab w:val="left" w:pos="2568"/>
+              </w:tabs>
+              <w:rPr>
+                <w:sz w:val="22"/>
+                <w:szCs w:val="22"/>
+              </w:rPr>
+            </w:pPr>
+            <w:r>
+              <w:rPr>
+                <w:sz w:val="22"/>
+                <w:szCs w:val="22"/>
+              </w:rPr>
+              <w:t>0°</w:t>
+            </w:r>
+          </w:p>
+        </w:tc>
+        <w:tc>
+          <w:tcPr>
+            <w:tcW w:w="2404" w:type="dxa"/>
+          </w:tcPr>
+          <w:p>
+            <w:pPr>
+              <w:tabs>
+                <w:tab w:val="left" w:pos="2568"/>
+              </w:tabs>
+              <w:rPr>
+                <w:sz w:val="22"/>
+                <w:szCs w:val="22"/>
+              </w:rPr>
+            </w:pPr>
+          </w:p>
+        </w:tc>
+      </w:tr>
+      <w:tr>
+        <w:tc>
+          <w:tcPr>
+            <w:tcW w:w="704" w:type="dxa"/>
+          </w:tcPr>
+          <w:p>
+            <w:pPr>
+              <w:tabs>
+                <w:tab w:val="left" w:pos="2568"/>
+              </w:tabs>
+              <w:rPr>
+                <w:sz w:val="22"/>
+                <w:szCs w:val="22"/>
+              </w:rPr>
+            </w:pPr>
+            <w:r>
+              <w:rPr>
+                <w:sz w:val="22"/>
+                <w:szCs w:val="22"/>
+              </w:rPr>
+              <w:t>3</w:t>
+            </w:r>
+          </w:p>
+        </w:tc>
+        <w:tc>
+          <w:tcPr>
+            <w:tcW w:w="1701" w:type="dxa"/>
+          </w:tcPr>
+          <w:p>
+            <w:pPr>
+              <w:tabs>
+                <w:tab w:val="left" w:pos="2568"/>
+              </w:tabs>
+              <w:rPr>
+                <w:sz w:val="22"/>
+                <w:szCs w:val="22"/>
+              </w:rPr>
+            </w:pPr>
+            <w:r>
+              <w:rPr>
+                <w:sz w:val="22"/>
+                <w:szCs w:val="22"/>
+              </w:rPr>
+              <w:t>-45°</w:t>
+            </w:r>
+          </w:p>
+        </w:tc>
+        <w:tc>
+          <w:tcPr>
+            <w:tcW w:w="2268" w:type="dxa"/>
+          </w:tcPr>
+          <w:p>
+            <w:pPr>
+              <w:tabs>
+                <w:tab w:val="left" w:pos="2568"/>
+              </w:tabs>
+              <w:rPr>
+                <w:sz w:val="22"/>
+                <w:szCs w:val="22"/>
+              </w:rPr>
+            </w:pPr>
+          </w:p>
+        </w:tc>
+        <w:tc>
+          <w:tcPr>
+            <w:tcW w:w="1985" w:type="dxa"/>
+          </w:tcPr>
+          <w:p>
+            <w:pPr>
+              <w:tabs>
+                <w:tab w:val="left" w:pos="2568"/>
+              </w:tabs>
+              <w:rPr>
+                <w:sz w:val="22"/>
+                <w:szCs w:val="22"/>
+              </w:rPr>
+            </w:pPr>
+            <w:r>
+              <w:rPr>
+                <w:sz w:val="22"/>
+                <w:szCs w:val="22"/>
+              </w:rPr>
+              <w:t>45°</w:t>
+            </w:r>
+          </w:p>
+        </w:tc>
+        <w:tc>
+          <w:tcPr>
+            <w:tcW w:w="2404" w:type="dxa"/>
+          </w:tcPr>
+          <w:p>
+            <w:pPr>
+              <w:tabs>
+                <w:tab w:val="left" w:pos="2568"/>
+              </w:tabs>
+              <w:rPr>
+                <w:sz w:val="22"/>
+                <w:szCs w:val="22"/>
+              </w:rPr>
+            </w:pPr>
+          </w:p>
+        </w:tc>
+      </w:tr>
+      <w:tr>
+        <w:tc>
+          <w:tcPr>
+            <w:tcW w:w="704" w:type="dxa"/>
+          </w:tcPr>
+          <w:p>
+            <w:pPr>
+              <w:tabs>
+                <w:tab w:val="left" w:pos="2568"/>
+              </w:tabs>
+              <w:rPr>
+                <w:sz w:val="22"/>
+                <w:szCs w:val="22"/>
+              </w:rPr>
+            </w:pPr>
+            <w:r>
+              <w:rPr>
+                <w:sz w:val="22"/>
+                <w:szCs w:val="22"/>
+              </w:rPr>
+              <w:t>4</w:t>
+            </w:r>
+          </w:p>
+        </w:tc>
+        <w:tc>
+          <w:tcPr>
+            <w:tcW w:w="1701" w:type="dxa"/>
+          </w:tcPr>
+          <w:p>
+            <w:pPr>
+              <w:tabs>
+                <w:tab w:val="left" w:pos="2568"/>
+              </w:tabs>
+              <w:rPr>
+                <w:sz w:val="22"/>
+                <w:szCs w:val="22"/>
+              </w:rPr>
+            </w:pPr>
+            <w:r>
+              <w:rPr>
+                <w:sz w:val="22"/>
+                <w:szCs w:val="22"/>
+              </w:rPr>
+              <w:t>90°</w:t>
+            </w:r>
+          </w:p>
+        </w:tc>
+        <w:tc>
+          <w:tcPr>
+            <w:tcW w:w="2268" w:type="dxa"/>
+          </w:tcPr>
+          <w:p>
+            <w:pPr>
+              <w:tabs>
+                <w:tab w:val="left" w:pos="2568"/>
+              </w:tabs>
+              <w:rPr>
+                <w:sz w:val="22"/>
+                <w:szCs w:val="22"/>
+              </w:rPr>
+            </w:pPr>
+          </w:p>
+        </w:tc>
+        <w:tc>
+          <w:tcPr>
+            <w:tcW w:w="1985" w:type="dxa"/>
+          </w:tcPr>
+          <w:p>
+            <w:pPr>
+              <w:tabs>
+                <w:tab w:val="left" w:pos="2568"/>
+              </w:tabs>
+              <w:rPr>
+                <w:sz w:val="22"/>
+                <w:szCs w:val="22"/>
+              </w:rPr>
+            </w:pPr>
+            <w:r>
+              <w:rPr>
+                <w:sz w:val="22"/>
+                <w:szCs w:val="22"/>
+              </w:rPr>
+              <w:t>-45°</w:t>
+            </w:r>
+          </w:p>
+        </w:tc>
+        <w:tc>
+          <w:tcPr>
+            <w:tcW w:w="2404" w:type="dxa"/>
+          </w:tcPr>
+          <w:p>
+            <w:pPr>
+              <w:tabs>
+                <w:tab w:val="left" w:pos="2568"/>
+              </w:tabs>
+              <w:rPr>
+                <w:sz w:val="22"/>
+                <w:szCs w:val="22"/>
+              </w:rPr>
+            </w:pPr>
+          </w:p>
+        </w:tc>
+      </w:tr>
+      <w:tr>
+        <w:trPr>
+          <w:trHeight w:val="64"/>
+        </w:trPr>
+        <w:tc>
+          <w:tcPr>
+            <w:tcW w:w="704" w:type="dxa"/>
+          </w:tcPr>
+          <w:p>
+            <w:pPr>
+              <w:tabs>
+                <w:tab w:val="left" w:pos="2568"/>
+              </w:tabs>
+              <w:rPr>
+                <w:sz w:val="22"/>
+                <w:szCs w:val="22"/>
+              </w:rPr>
+            </w:pPr>
+            <w:r>
+              <w:rPr>
+                <w:sz w:val="22"/>
+                <w:szCs w:val="22"/>
+              </w:rPr>
+              <w:t>5</w:t>
+            </w:r>
+          </w:p>
+        </w:tc>
+        <w:tc>
+          <w:tcPr>
+            <w:tcW w:w="1701" w:type="dxa"/>
+          </w:tcPr>
+          <w:p>
+            <w:pPr>
+              <w:tabs>
+                <w:tab w:val="left" w:pos="2568"/>
+              </w:tabs>
+              <w:rPr>
+                <w:sz w:val="22"/>
+                <w:szCs w:val="22"/>
+              </w:rPr>
+            </w:pPr>
+            <w:r>
+              <w:rPr>
+                <w:sz w:val="22"/>
+                <w:szCs w:val="22"/>
+              </w:rPr>
+              <w:t>Egal</w:t>
+            </w:r>
+          </w:p>
+        </w:tc>
+        <w:tc>
+          <w:tcPr>
+            <w:tcW w:w="2268" w:type="dxa"/>
+          </w:tcPr>
+          <w:p>
+            <w:pPr>
+              <w:tabs>
+                <w:tab w:val="left" w:pos="2568"/>
+              </w:tabs>
+              <w:rPr>
+                <w:sz w:val="22"/>
+                <w:szCs w:val="22"/>
+              </w:rPr>
+            </w:pPr>
+          </w:p>
+        </w:tc>
+        <w:tc>
+          <w:tcPr>
+            <w:tcW w:w="1985" w:type="dxa"/>
+          </w:tcPr>
+          <w:p>
+            <w:pPr>
+              <w:tabs>
+                <w:tab w:val="left" w:pos="2568"/>
+              </w:tabs>
+              <w:rPr>
+                <w:sz w:val="22"/>
+                <w:szCs w:val="22"/>
+              </w:rPr>
+            </w:pPr>
+            <w:r>
+              <w:rPr>
+                <w:sz w:val="22"/>
+                <w:szCs w:val="22"/>
+              </w:rPr>
+              <w:t>90°</w:t>
+            </w:r>
+          </w:p>
+        </w:tc>
+        <w:tc>
+          <w:tcPr>
+            <w:tcW w:w="2404" w:type="dxa"/>
+          </w:tcPr>
+          <w:p>
+            <w:pPr>
+              <w:tabs>
+                <w:tab w:val="left" w:pos="2568"/>
+              </w:tabs>
+              <w:rPr>
+                <w:sz w:val="22"/>
+                <w:szCs w:val="22"/>
+              </w:rPr>
+            </w:pPr>
+          </w:p>
+        </w:tc>
+      </w:tr>
+    </w:tbl>
+    <w:p>
+      <w:pPr>
+        <w:tabs>
+          <w:tab w:val="left" w:pos="2568"/>
+        </w:tabs>
+        <w:spacing w:line="240" w:lineRule="auto"/>
+        <w:rPr>
+          <w:sz w:val="22"/>
+          <w:szCs w:val="22"/>
+        </w:rPr>
+      </w:pPr>
+      <w:r>
+        <w:rPr>
+          <w:sz w:val="22"/>
+          <w:szCs w:val="22"/>
+        </w:rPr>
         <w:br/>
+        <w:t xml:space="preserve">Test 2: setze </w:t>
+      </w:r>
+      <w:r>
+        <w:rPr>
+          <w:sz w:val="22"/>
+          <w:szCs w:val="22"/>
+        </w:rPr>
+        <w:t>fünf</w:t>
+      </w:r>
+      <w:r>
+        <w:rPr>
+          <w:sz w:val="22"/>
+          <w:szCs w:val="22"/>
+        </w:rPr>
+        <w:t xml:space="preserve"> Instrumente in den Raum, ändere die Lautstärke von </w:t>
+      </w:r>
+      <w:r>
+        <w:rPr>
+          <w:sz w:val="22"/>
+          <w:szCs w:val="22"/>
+        </w:rPr>
+        <w:t>zweien davon, entferne</w:t>
+      </w:r>
+      <w:r>
+        <w:rPr>
+          <w:sz w:val="22"/>
+          <w:szCs w:val="22"/>
+        </w:rPr>
+        <w:t xml:space="preserve"> </w:t>
+      </w:r>
+      <w:r>
+        <w:rPr>
+          <w:sz w:val="22"/>
+          <w:szCs w:val="22"/>
+        </w:rPr>
+        <w:t>eins</w:t>
+      </w:r>
+      <w:r>
+        <w:rPr>
+          <w:sz w:val="22"/>
+          <w:szCs w:val="22"/>
+        </w:rPr>
+        <w:t xml:space="preserve"> wieder aus dem Raum. Mache das </w:t>
+      </w:r>
+      <w:r>
+        <w:rPr>
+          <w:sz w:val="22"/>
+          <w:szCs w:val="22"/>
+        </w:rPr>
+        <w:t>5</w:t>
+      </w:r>
+      <w:r>
+        <w:rPr>
+          <w:sz w:val="22"/>
+          <w:szCs w:val="22"/>
+        </w:rPr>
+        <w:t xml:space="preserve"> mal mit unterschietlichen Grei</w:t>
+      </w:r>
+      <w:r>
+        <w:rPr>
+          <w:sz w:val="22"/>
+          <w:szCs w:val="22"/>
+        </w:rPr>
+        <w:t>f</w:t>
+      </w:r>
+      <w:r>
+        <w:rPr>
+          <w:sz w:val="22"/>
+          <w:szCs w:val="22"/>
+        </w:rPr>
+        <w:t>er</w:t>
+      </w:r>
+      <w:r>
+        <w:rPr>
+          <w:sz w:val="22"/>
+          <w:szCs w:val="22"/>
+        </w:rPr>
+        <w:t>-K</w:t>
+      </w:r>
+      <w:r>
+        <w:rPr>
+          <w:sz w:val="22"/>
+          <w:szCs w:val="22"/>
+        </w:rPr>
+        <w:t>ennung</w:t>
+      </w:r>
+      <w:r>
+        <w:rPr>
+          <w:sz w:val="22"/>
+          <w:szCs w:val="22"/>
+        </w:rPr>
+        <w:t>smethoden</w:t>
+      </w:r>
+      <w:r>
+        <w:rPr>
+          <w:sz w:val="22"/>
+          <w:szCs w:val="22"/>
+        </w:rPr>
+        <w:t xml:space="preserve"> (ich stelle das </w:t>
+      </w:r>
+      <w:r>
+        <w:rPr>
+          <w:sz w:val="22"/>
+          <w:szCs w:val="22"/>
+        </w:rPr>
+        <w:t>zwischendurch</w:t>
+      </w:r>
+      <w:r>
+        <w:rPr>
+          <w:sz w:val="22"/>
+          <w:szCs w:val="22"/>
+        </w:rPr>
+        <w:t xml:space="preserve"> um)</w:t>
+      </w:r>
+    </w:p>
+    <w:tbl>
+      <w:tblPr>
+        <w:tblStyle w:val="Tabellenraster"/>
+        <w:tblW w:w="0" w:type="auto"/>
+        <w:tblLook w:val="04A0" w:firstRow="1" w:lastRow="0" w:firstColumn="1" w:lastColumn="0" w:noHBand="0" w:noVBand="1"/>
+      </w:tblPr>
+      <w:tblGrid>
+        <w:gridCol w:w="1980"/>
+        <w:gridCol w:w="2410"/>
+        <w:gridCol w:w="4672"/>
+      </w:tblGrid>
+      <w:tr>
+        <w:tc>
+          <w:tcPr>
+            <w:tcW w:w="1980" w:type="dxa"/>
+          </w:tcPr>
+          <w:p>
+            <w:pPr>
+              <w:tabs>
+                <w:tab w:val="left" w:pos="2568"/>
+              </w:tabs>
+              <w:rPr>
+                <w:sz w:val="22"/>
+                <w:szCs w:val="22"/>
+              </w:rPr>
+            </w:pPr>
+            <w:r>
+              <w:rPr>
+                <w:sz w:val="22"/>
+                <w:szCs w:val="22"/>
+              </w:rPr>
+              <w:t>Methode</w:t>
+            </w:r>
+          </w:p>
+        </w:tc>
+        <w:tc>
+          <w:tcPr>
+            <w:tcW w:w="2410" w:type="dxa"/>
+          </w:tcPr>
+          <w:p>
+            <w:pPr>
+              <w:tabs>
+                <w:tab w:val="left" w:pos="2568"/>
+              </w:tabs>
+              <w:rPr>
+                <w:sz w:val="22"/>
+                <w:szCs w:val="22"/>
+              </w:rPr>
+            </w:pPr>
+            <w:r>
+              <w:rPr>
+                <w:sz w:val="22"/>
+                <w:szCs w:val="22"/>
+              </w:rPr>
+              <w:t>Wertung im vergleich</w:t>
+            </w:r>
+          </w:p>
+        </w:tc>
+        <w:tc>
+          <w:tcPr>
+            <w:tcW w:w="4672" w:type="dxa"/>
+          </w:tcPr>
+          <w:p>
+            <w:pPr>
+              <w:tabs>
+                <w:tab w:val="left" w:pos="2568"/>
+              </w:tabs>
+              <w:rPr>
+                <w:sz w:val="22"/>
+                <w:szCs w:val="22"/>
+              </w:rPr>
+            </w:pPr>
+            <w:r>
+              <w:rPr>
+                <w:sz w:val="22"/>
+                <w:szCs w:val="22"/>
+              </w:rPr>
+              <w:t xml:space="preserve">Anmerkungen </w:t>
+            </w:r>
+          </w:p>
+        </w:tc>
+      </w:tr>
+      <w:tr>
+        <w:tc>
+          <w:tcPr>
+            <w:tcW w:w="1980" w:type="dxa"/>
+          </w:tcPr>
+          <w:p>
+            <w:pPr>
+              <w:tabs>
+                <w:tab w:val="left" w:pos="2568"/>
+              </w:tabs>
+              <w:rPr>
+                <w:sz w:val="22"/>
+                <w:szCs w:val="22"/>
+              </w:rPr>
+            </w:pPr>
+            <w:r>
+              <w:rPr>
+                <w:sz w:val="22"/>
+                <w:szCs w:val="22"/>
+              </w:rPr>
+              <w:t>Statisch 2 von 3</w:t>
+            </w:r>
+          </w:p>
+        </w:tc>
+        <w:tc>
+          <w:tcPr>
+            <w:tcW w:w="2410" w:type="dxa"/>
+          </w:tcPr>
+          <w:p>
+            <w:pPr>
+              <w:tabs>
+                <w:tab w:val="left" w:pos="2568"/>
+              </w:tabs>
+              <w:rPr>
+                <w:sz w:val="22"/>
+                <w:szCs w:val="22"/>
+              </w:rPr>
+            </w:pPr>
+          </w:p>
+        </w:tc>
+        <w:tc>
+          <w:tcPr>
+            <w:tcW w:w="4672" w:type="dxa"/>
+          </w:tcPr>
+          <w:p>
+            <w:pPr>
+              <w:tabs>
+                <w:tab w:val="left" w:pos="2568"/>
+              </w:tabs>
+              <w:rPr>
+                <w:sz w:val="22"/>
+                <w:szCs w:val="22"/>
+              </w:rPr>
+            </w:pPr>
+          </w:p>
+        </w:tc>
+      </w:tr>
+      <w:tr>
+        <w:tc>
+          <w:tcPr>
+            <w:tcW w:w="1980" w:type="dxa"/>
+          </w:tcPr>
+          <w:p>
+            <w:pPr>
+              <w:tabs>
+                <w:tab w:val="left" w:pos="2568"/>
+              </w:tabs>
+              <w:rPr>
+                <w:sz w:val="22"/>
+                <w:szCs w:val="22"/>
+              </w:rPr>
+            </w:pPr>
+            <w:r>
+              <w:rPr>
+                <w:sz w:val="22"/>
+                <w:szCs w:val="22"/>
+              </w:rPr>
+              <w:t>Statisch 5 von 6</w:t>
+            </w:r>
+          </w:p>
+        </w:tc>
+        <w:tc>
+          <w:tcPr>
+            <w:tcW w:w="2410" w:type="dxa"/>
+          </w:tcPr>
+          <w:p>
+            <w:pPr>
+              <w:tabs>
+                <w:tab w:val="left" w:pos="2568"/>
+              </w:tabs>
+              <w:rPr>
+                <w:sz w:val="22"/>
+                <w:szCs w:val="22"/>
+              </w:rPr>
+            </w:pPr>
+          </w:p>
+        </w:tc>
+        <w:tc>
+          <w:tcPr>
+            <w:tcW w:w="4672" w:type="dxa"/>
+          </w:tcPr>
+          <w:p>
+            <w:pPr>
+              <w:tabs>
+                <w:tab w:val="left" w:pos="2568"/>
+              </w:tabs>
+              <w:rPr>
+                <w:sz w:val="22"/>
+                <w:szCs w:val="22"/>
+              </w:rPr>
+            </w:pPr>
+          </w:p>
+        </w:tc>
+      </w:tr>
+      <w:tr>
+        <w:tc>
+          <w:tcPr>
+            <w:tcW w:w="1980" w:type="dxa"/>
+          </w:tcPr>
+          <w:p>
+            <w:pPr>
+              <w:tabs>
+                <w:tab w:val="left" w:pos="2568"/>
+              </w:tabs>
+              <w:rPr>
+                <w:sz w:val="22"/>
+                <w:szCs w:val="22"/>
+              </w:rPr>
+            </w:pPr>
+            <w:r>
+              <w:rPr>
+                <w:sz w:val="22"/>
+                <w:szCs w:val="22"/>
+              </w:rPr>
+              <w:t>Statisch 9 von 10</w:t>
+            </w:r>
+          </w:p>
+        </w:tc>
+        <w:tc>
+          <w:tcPr>
+            <w:tcW w:w="2410" w:type="dxa"/>
+          </w:tcPr>
+          <w:p>
+            <w:pPr>
+              <w:tabs>
+                <w:tab w:val="left" w:pos="2568"/>
+              </w:tabs>
+              <w:rPr>
+                <w:sz w:val="22"/>
+                <w:szCs w:val="22"/>
+              </w:rPr>
+            </w:pPr>
+          </w:p>
+        </w:tc>
+        <w:tc>
+          <w:tcPr>
+            <w:tcW w:w="4672" w:type="dxa"/>
+          </w:tcPr>
+          <w:p>
+            <w:pPr>
+              <w:tabs>
+                <w:tab w:val="left" w:pos="2568"/>
+              </w:tabs>
+              <w:rPr>
+                <w:sz w:val="22"/>
+                <w:szCs w:val="22"/>
+              </w:rPr>
+            </w:pPr>
+          </w:p>
+        </w:tc>
+      </w:tr>
+      <w:tr>
+        <w:tc>
+          <w:tcPr>
+            <w:tcW w:w="1980" w:type="dxa"/>
+          </w:tcPr>
+          <w:p>
+            <w:pPr>
+              <w:tabs>
+                <w:tab w:val="left" w:pos="2568"/>
+              </w:tabs>
+              <w:rPr>
+                <w:sz w:val="22"/>
+                <w:szCs w:val="22"/>
+              </w:rPr>
+            </w:pPr>
+            <w:r>
+              <w:rPr>
+                <w:sz w:val="22"/>
+                <w:szCs w:val="22"/>
+              </w:rPr>
+              <w:t xml:space="preserve">Dynamisch </w:t>
+            </w:r>
+            <w:r>
+              <w:rPr>
+                <w:sz w:val="22"/>
+                <w:szCs w:val="22"/>
+              </w:rPr>
+              <w:t>1s</w:t>
+            </w:r>
+          </w:p>
+        </w:tc>
+        <w:tc>
+          <w:tcPr>
+            <w:tcW w:w="2410" w:type="dxa"/>
+          </w:tcPr>
+          <w:p>
+            <w:pPr>
+              <w:tabs>
+                <w:tab w:val="left" w:pos="2568"/>
+              </w:tabs>
+              <w:rPr>
+                <w:sz w:val="22"/>
+                <w:szCs w:val="22"/>
+              </w:rPr>
+            </w:pPr>
+          </w:p>
+        </w:tc>
+        <w:tc>
+          <w:tcPr>
+            <w:tcW w:w="4672" w:type="dxa"/>
+          </w:tcPr>
+          <w:p>
+            <w:pPr>
+              <w:tabs>
+                <w:tab w:val="left" w:pos="2568"/>
+              </w:tabs>
+              <w:rPr>
+                <w:sz w:val="22"/>
+                <w:szCs w:val="22"/>
+              </w:rPr>
+            </w:pPr>
+          </w:p>
+        </w:tc>
+      </w:tr>
+      <w:tr>
+        <w:tc>
+          <w:tcPr>
+            <w:tcW w:w="1980" w:type="dxa"/>
+          </w:tcPr>
+          <w:p>
+            <w:pPr>
+              <w:tabs>
+                <w:tab w:val="left" w:pos="2568"/>
+              </w:tabs>
+              <w:rPr>
+                <w:sz w:val="22"/>
+                <w:szCs w:val="22"/>
+              </w:rPr>
+            </w:pPr>
+            <w:r>
+              <w:rPr>
+                <w:sz w:val="22"/>
+                <w:szCs w:val="22"/>
+              </w:rPr>
+              <w:t>Dynamisch 0.5s</w:t>
+            </w:r>
+          </w:p>
+        </w:tc>
+        <w:tc>
+          <w:tcPr>
+            <w:tcW w:w="2410" w:type="dxa"/>
+          </w:tcPr>
+          <w:p>
+            <w:pPr>
+              <w:tabs>
+                <w:tab w:val="left" w:pos="2568"/>
+              </w:tabs>
+              <w:rPr>
+                <w:sz w:val="22"/>
+                <w:szCs w:val="22"/>
+              </w:rPr>
+            </w:pPr>
+          </w:p>
+        </w:tc>
+        <w:tc>
+          <w:tcPr>
+            <w:tcW w:w="4672" w:type="dxa"/>
+          </w:tcPr>
+          <w:p>
+            <w:pPr>
+              <w:tabs>
+                <w:tab w:val="left" w:pos="2568"/>
+              </w:tabs>
+              <w:rPr>
+                <w:sz w:val="22"/>
+                <w:szCs w:val="22"/>
+              </w:rPr>
+            </w:pPr>
+          </w:p>
+        </w:tc>
+      </w:tr>
+    </w:tbl>
+    <w:p>
+      <w:pPr>
+        <w:tabs>
+          <w:tab w:val="left" w:pos="2568"/>
+        </w:tabs>
+      </w:pPr>
+      <w:r>
+        <w:br/>
+        <w:t>Sonstige Anmerkungen oder Feedback: _____________________________________________ __________________________________________________________________________________</w:t>
       </w:r>
     </w:p>
     <w:sectPr>
@@ -1348,6 +2770,25 @@
       <w:spacing w:val="5"/>
     </w:rPr>
   </w:style>
+  <w:style w:type="table" w:styleId="Tabellenraster">
+    <w:name w:val="Table Grid"/>
+    <w:basedOn w:val="NormaleTabelle"/>
+    <w:uiPriority w:val="39"/>
+    <w:rsid w:val="00C21263"/>
+    <w:pPr>
+      <w:spacing w:after="0" w:line="240" w:lineRule="auto"/>
+    </w:pPr>
+    <w:tblPr>
+      <w:tblBorders>
+        <w:top w:val="single" w:sz="4" w:space="0" w:color="auto"/>
+        <w:left w:val="single" w:sz="4" w:space="0" w:color="auto"/>
+        <w:bottom w:val="single" w:sz="4" w:space="0" w:color="auto"/>
+        <w:right w:val="single" w:sz="4" w:space="0" w:color="auto"/>
+        <w:insideH w:val="single" w:sz="4" w:space="0" w:color="auto"/>
+        <w:insideV w:val="single" w:sz="4" w:space="0" w:color="auto"/>
+      </w:tblBorders>
+    </w:tblPr>
+  </w:style>
 </w:styles>
 </file>
 

</xml_diff>

<commit_message>
home... änderungen am nemü bild
</commit_message>
<xml_diff>
--- a/Testprotokoll für die Gestensteuerung.docx
+++ b/Testprotokoll für die Gestensteuerung.docx
@@ -15,6 +15,9 @@
       <w:r>
         <w:t xml:space="preserve"> Gestensteuerung </w:t>
       </w:r>
+      <w:r>
+        <w:t>v2</w:t>
+      </w:r>
     </w:p>
     <w:p>
       <w:pPr>
@@ -29,14 +32,7 @@
           <w:sz w:val="22"/>
           <w:szCs w:val="22"/>
         </w:rPr>
-        <w:t>Im Rahmen der</w:t>
-      </w:r>
-      <w:r>
-        <w:rPr>
-          <w:sz w:val="22"/>
-          <w:szCs w:val="22"/>
-        </w:rPr>
-        <w:t xml:space="preserve"> Masterarbeit von Jonas Wegener</w:t>
+        <w:t>Im Rahmen der Masterarbeit von Jonas Wegener</w:t>
       </w:r>
     </w:p>
     <w:p>
@@ -52,21 +48,7 @@
           <w:sz w:val="22"/>
           <w:szCs w:val="22"/>
         </w:rPr>
-        <w:t>Ort: BHT-</w:t>
-      </w:r>
-      <w:r>
-        <w:rPr>
-          <w:sz w:val="22"/>
-          <w:szCs w:val="22"/>
-        </w:rPr>
-        <w:t>Berlin</w:t>
-      </w:r>
-      <w:r>
-        <w:rPr>
-          <w:sz w:val="22"/>
-          <w:szCs w:val="22"/>
-        </w:rPr>
-        <w:t>, Raum B217a | Datum:</w:t>
+        <w:t>Ort: BHT-Berlin, Raum B217a | Datum:</w:t>
       </w:r>
       <w:r>
         <w:rPr>
@@ -226,7 +208,21 @@
           <w:sz w:val="22"/>
           <w:szCs w:val="22"/>
         </w:rPr>
-        <w:t>u spielst den Dirigenten und kannst deine Musikinstrumente im Raum platzieren (die Soundwiedergabe ist noch nicht verbunden). Probiere die Steuerung aus und entdecke alle Funktionen!</w:t>
+        <w:t xml:space="preserve">u spielst den Dirigenten und kannst deine Musikinstrumente im Raum platzieren (die Soundwiedergabe ist noch nicht verbunden). </w:t>
+      </w:r>
+      <w:r>
+        <w:rPr>
+          <w:sz w:val="22"/>
+          <w:szCs w:val="22"/>
+        </w:rPr>
+        <w:t xml:space="preserve">Für die Raumrichtung orientiere dich am echten Raum, nicht am Bildschirm. </w:t>
+      </w:r>
+      <w:r>
+        <w:rPr>
+          <w:sz w:val="22"/>
+          <w:szCs w:val="22"/>
+        </w:rPr>
+        <w:t>Probiere die Steuerung aus und entdecke alle Funktionen!</w:t>
       </w:r>
     </w:p>
     <w:p>
@@ -419,6 +415,65 @@
           <w:szCs w:val="22"/>
         </w:rPr>
         <w:br/>
+        <w:t>ein Instrument</w:t>
+      </w:r>
+      <w:r>
+        <w:rPr>
+          <w:sz w:val="22"/>
+          <w:szCs w:val="22"/>
+        </w:rPr>
+        <w:t xml:space="preserve"> </w:t>
+      </w:r>
+      <w:r>
+        <w:rPr>
+          <w:sz w:val="22"/>
+          <w:szCs w:val="22"/>
+        </w:rPr>
+        <w:t>entfernen</w:t>
+      </w:r>
+      <w:r>
+        <w:rPr>
+          <w:sz w:val="22"/>
+          <w:szCs w:val="22"/>
+        </w:rPr>
+        <w:tab/>
+      </w:r>
+      <w:r>
+        <w:rPr>
+          <w:sz w:val="22"/>
+          <w:szCs w:val="22"/>
+        </w:rPr>
+        <w:tab/>
+      </w:r>
+      <w:r>
+        <w:rPr>
+          <w:sz w:val="22"/>
+          <w:szCs w:val="22"/>
+        </w:rPr>
+        <w:tab/>
+        <w:t>☐</w:t>
+      </w:r>
+      <w:r>
+        <w:rPr>
+          <w:sz w:val="22"/>
+          <w:szCs w:val="22"/>
+        </w:rPr>
+        <w:tab/>
+      </w:r>
+      <w:r>
+        <w:rPr>
+          <w:sz w:val="22"/>
+          <w:szCs w:val="22"/>
+        </w:rPr>
+        <w:tab/>
+        <w:t>☐</w:t>
+      </w:r>
+      <w:r>
+        <w:rPr>
+          <w:sz w:val="22"/>
+          <w:szCs w:val="22"/>
+        </w:rPr>
+        <w:br/>
         <w:t>Informations-Fenster erhalten</w:t>
       </w:r>
       <w:r>
@@ -600,7 +655,28 @@
           <w:sz w:val="22"/>
           <w:szCs w:val="22"/>
         </w:rPr>
-        <w:t xml:space="preserve"> Was hat gefallen? Was sollte anders sein?</w:t>
+        <w:t xml:space="preserve"> </w:t>
+      </w:r>
+      <w:r>
+        <w:rPr>
+          <w:sz w:val="22"/>
+          <w:szCs w:val="22"/>
+        </w:rPr>
+        <w:t xml:space="preserve">Wie kann man die Benutzererfahrung </w:t>
+      </w:r>
+      <w:r>
+        <w:rPr>
+          <w:sz w:val="22"/>
+          <w:szCs w:val="22"/>
+        </w:rPr>
+        <w:t>verbessern</w:t>
+      </w:r>
+      <w:r>
+        <w:rPr>
+          <w:sz w:val="22"/>
+          <w:szCs w:val="22"/>
+        </w:rPr>
+        <w:t>?</w:t>
       </w:r>
       <w:r>
         <w:br/>
@@ -703,15 +779,13 @@
                 <w:szCs w:val="22"/>
               </w:rPr>
             </w:pPr>
-            <w:proofErr w:type="spellStart"/>
             <w:r>
               <w:rPr>
                 <w:sz w:val="22"/>
                 <w:szCs w:val="22"/>
               </w:rPr>
-              <w:t>unit</w:t>
+              <w:t>Unit</w:t>
             </w:r>
-            <w:proofErr w:type="spellEnd"/>
           </w:p>
         </w:tc>
         <w:tc>
@@ -1392,7 +1466,7 @@
           <w:sz w:val="22"/>
           <w:szCs w:val="22"/>
         </w:rPr>
-        <w:t>5</w:t>
+        <w:t>3</w:t>
       </w:r>
       <w:r>
         <w:rPr>
@@ -1420,7 +1494,14 @@
           <w:sz w:val="22"/>
           <w:szCs w:val="22"/>
         </w:rPr>
-        <w:t>-K</w:t>
+        <w:t>-</w:t>
+      </w:r>
+      <w:r>
+        <w:rPr>
+          <w:sz w:val="22"/>
+          <w:szCs w:val="22"/>
+        </w:rPr>
+        <w:t>Erk</w:t>
       </w:r>
       <w:r>
         <w:rPr>
@@ -1456,6 +1537,13 @@
           <w:szCs w:val="22"/>
         </w:rPr>
         <w:t xml:space="preserve"> um)</w:t>
+      </w:r>
+      <w:r>
+        <w:rPr>
+          <w:sz w:val="22"/>
+          <w:szCs w:val="22"/>
+        </w:rPr>
+        <w:t>.</w:t>
       </w:r>
     </w:p>
     <w:tbl>
@@ -1674,63 +1762,6 @@
                 <w:sz w:val="22"/>
                 <w:szCs w:val="22"/>
               </w:rPr>
-              <w:t>Statisch 9 von 10</w:t>
-            </w:r>
-          </w:p>
-        </w:tc>
-        <w:tc>
-          <w:tcPr>
-            <w:tcW w:w="2410" w:type="dxa"/>
-          </w:tcPr>
-          <w:p>
-            <w:pPr>
-              <w:tabs>
-                <w:tab w:val="left" w:pos="2568"/>
-              </w:tabs>
-              <w:rPr>
-                <w:sz w:val="22"/>
-                <w:szCs w:val="22"/>
-              </w:rPr>
-            </w:pPr>
-          </w:p>
-        </w:tc>
-        <w:tc>
-          <w:tcPr>
-            <w:tcW w:w="4672" w:type="dxa"/>
-          </w:tcPr>
-          <w:p>
-            <w:pPr>
-              <w:tabs>
-                <w:tab w:val="left" w:pos="2568"/>
-              </w:tabs>
-              <w:rPr>
-                <w:sz w:val="22"/>
-                <w:szCs w:val="22"/>
-              </w:rPr>
-            </w:pPr>
-          </w:p>
-        </w:tc>
-      </w:tr>
-      <w:tr>
-        <w:tc>
-          <w:tcPr>
-            <w:tcW w:w="1980" w:type="dxa"/>
-          </w:tcPr>
-          <w:p>
-            <w:pPr>
-              <w:tabs>
-                <w:tab w:val="left" w:pos="2568"/>
-              </w:tabs>
-              <w:rPr>
-                <w:sz w:val="22"/>
-                <w:szCs w:val="22"/>
-              </w:rPr>
-            </w:pPr>
-            <w:r>
-              <w:rPr>
-                <w:sz w:val="22"/>
-                <w:szCs w:val="22"/>
-              </w:rPr>
               <w:t xml:space="preserve">Dynamisch </w:t>
             </w:r>
             <w:r>
@@ -1739,63 +1770,6 @@
                 <w:szCs w:val="22"/>
               </w:rPr>
               <w:t>1s</w:t>
-            </w:r>
-          </w:p>
-        </w:tc>
-        <w:tc>
-          <w:tcPr>
-            <w:tcW w:w="2410" w:type="dxa"/>
-          </w:tcPr>
-          <w:p>
-            <w:pPr>
-              <w:tabs>
-                <w:tab w:val="left" w:pos="2568"/>
-              </w:tabs>
-              <w:rPr>
-                <w:sz w:val="22"/>
-                <w:szCs w:val="22"/>
-              </w:rPr>
-            </w:pPr>
-          </w:p>
-        </w:tc>
-        <w:tc>
-          <w:tcPr>
-            <w:tcW w:w="4672" w:type="dxa"/>
-          </w:tcPr>
-          <w:p>
-            <w:pPr>
-              <w:tabs>
-                <w:tab w:val="left" w:pos="2568"/>
-              </w:tabs>
-              <w:rPr>
-                <w:sz w:val="22"/>
-                <w:szCs w:val="22"/>
-              </w:rPr>
-            </w:pPr>
-          </w:p>
-        </w:tc>
-      </w:tr>
-      <w:tr>
-        <w:tc>
-          <w:tcPr>
-            <w:tcW w:w="1980" w:type="dxa"/>
-          </w:tcPr>
-          <w:p>
-            <w:pPr>
-              <w:tabs>
-                <w:tab w:val="left" w:pos="2568"/>
-              </w:tabs>
-              <w:rPr>
-                <w:sz w:val="22"/>
-                <w:szCs w:val="22"/>
-              </w:rPr>
-            </w:pPr>
-            <w:r>
-              <w:rPr>
-                <w:sz w:val="22"/>
-                <w:szCs w:val="22"/>
-              </w:rPr>
-              <w:t>Dynamisch 0.5s</w:t>
             </w:r>
           </w:p>
         </w:tc>
@@ -1841,7 +1815,7 @@
       </w:pPr>
       <w:r>
         <w:br/>
-        <w:t>Sonstige Anmerkungen oder Feedback: _____________________________________________ __________________________________________________________________________________</w:t>
+        <w:t xml:space="preserve">Sonstige Anmerkungen oder Feedback: </w:t>
       </w:r>
     </w:p>
     <w:sectPr>
@@ -2457,6 +2431,7 @@
   <w:style w:type="character" w:default="1" w:styleId="Absatz-Standardschriftart">
     <w:name w:val="Default Paragraph Font"/>
     <w:uiPriority w:val="1"/>
+    <w:semiHidden/>
     <w:unhideWhenUsed/>
   </w:style>
   <w:style w:type="table" w:default="1" w:styleId="NormaleTabelle">

</xml_diff>